<commit_message>
MySQL Database Storage Documentation
</commit_message>
<xml_diff>
--- a/documentation/Step 6.docx
+++ b/documentation/Step 6.docx
@@ -28,14 +28,7 @@
           <w:b/>
           <w:bCs/>
         </w:rPr>
-        <w:t xml:space="preserve"> — </w:t>
-      </w:r>
-      <w:r>
-        <w:rPr>
-          <w:b/>
-          <w:bCs/>
-        </w:rPr>
-        <w:t>MYSQL DATABASE STORAGE</w:t>
+        <w:t xml:space="preserve"> — MYSQL DATABASE STORAGE</w:t>
       </w:r>
     </w:p>
     <w:p>
@@ -767,6 +760,780 @@
         <w:t>Python was successfully connected to the MySQL database, allowing the Fraud Analytics System to move from file-based storage to database-based storage.</w:t>
       </w:r>
     </w:p>
+    <w:p>
+      <w:pPr>
+        <w:rPr>
+          <w:b/>
+          <w:bCs/>
+        </w:rPr>
+      </w:pPr>
+      <w:r>
+        <w:rPr>
+          <w:b/>
+          <w:bCs/>
+        </w:rPr>
+        <w:t xml:space="preserve">STEP </w:t>
+      </w:r>
+      <w:r>
+        <w:rPr>
+          <w:b/>
+          <w:bCs/>
+        </w:rPr>
+        <w:t>6</w:t>
+      </w:r>
+      <w:r>
+        <w:rPr>
+          <w:b/>
+          <w:bCs/>
+        </w:rPr>
+        <w:t>.4 — TEST DATABASE TABLE CREATION</w:t>
+      </w:r>
+    </w:p>
+    <w:p>
+      <w:pPr>
+        <w:rPr>
+          <w:b/>
+          <w:bCs/>
+        </w:rPr>
+      </w:pPr>
+      <w:r>
+        <w:rPr>
+          <w:b/>
+          <w:bCs/>
+        </w:rPr>
+        <w:t>OBJECTIVE</w:t>
+      </w:r>
+    </w:p>
+    <w:p>
+      <w:r>
+        <w:t>Validate the Python-to-MySQL integration by creating a sample database table and loading a small subset of transaction records.</w:t>
+      </w:r>
+    </w:p>
+    <w:p>
+      <w:pPr>
+        <w:rPr>
+          <w:b/>
+          <w:bCs/>
+        </w:rPr>
+      </w:pPr>
+      <w:r>
+        <w:rPr>
+          <w:b/>
+          <w:bCs/>
+        </w:rPr>
+        <w:t>STEPS PERFORMED</w:t>
+      </w:r>
+    </w:p>
+    <w:p>
+      <w:pPr>
+        <w:numPr>
+          <w:ilvl w:val="0"/>
+          <w:numId w:val="9"/>
+        </w:numPr>
+      </w:pPr>
+      <w:r>
+        <w:t xml:space="preserve">Established a successful connection between Python and MySQL </w:t>
+      </w:r>
+    </w:p>
+    <w:p>
+      <w:pPr>
+        <w:numPr>
+          <w:ilvl w:val="0"/>
+          <w:numId w:val="9"/>
+        </w:numPr>
+      </w:pPr>
+      <w:r>
+        <w:lastRenderedPageBreak/>
+        <w:t xml:space="preserve">Selected the first 1,000 transaction records from the master dataset </w:t>
+      </w:r>
+    </w:p>
+    <w:p>
+      <w:pPr>
+        <w:numPr>
+          <w:ilvl w:val="0"/>
+          <w:numId w:val="9"/>
+        </w:numPr>
+      </w:pPr>
+      <w:r>
+        <w:t xml:space="preserve">Created the </w:t>
+      </w:r>
+      <w:proofErr w:type="spellStart"/>
+      <w:r>
+        <w:t>transactions_master</w:t>
+      </w:r>
+      <w:proofErr w:type="spellEnd"/>
+      <w:r>
+        <w:t xml:space="preserve"> table using the dataset schema </w:t>
+      </w:r>
+    </w:p>
+    <w:p>
+      <w:pPr>
+        <w:numPr>
+          <w:ilvl w:val="0"/>
+          <w:numId w:val="9"/>
+        </w:numPr>
+      </w:pPr>
+      <w:r>
+        <w:t xml:space="preserve">Loaded sample transaction records into MySQL </w:t>
+      </w:r>
+    </w:p>
+    <w:p>
+      <w:pPr>
+        <w:numPr>
+          <w:ilvl w:val="0"/>
+          <w:numId w:val="9"/>
+        </w:numPr>
+      </w:pPr>
+      <w:r>
+        <w:t xml:space="preserve">Verified successful table creation using SQL queries </w:t>
+      </w:r>
+    </w:p>
+    <w:p>
+      <w:pPr>
+        <w:rPr>
+          <w:b/>
+          <w:bCs/>
+        </w:rPr>
+      </w:pPr>
+      <w:r>
+        <w:rPr>
+          <w:b/>
+          <w:bCs/>
+        </w:rPr>
+        <w:t>VERIFICATION</w:t>
+      </w:r>
+    </w:p>
+    <w:p>
+      <w:r>
+        <w:t xml:space="preserve">Table Name: </w:t>
+      </w:r>
+      <w:proofErr w:type="spellStart"/>
+      <w:r>
+        <w:t>transactions_master</w:t>
+      </w:r>
+      <w:proofErr w:type="spellEnd"/>
+      <w:r>
+        <w:br/>
+        <w:t>Rows Loaded: 1,000</w:t>
+      </w:r>
+    </w:p>
+    <w:p>
+      <w:pPr>
+        <w:rPr>
+          <w:b/>
+          <w:bCs/>
+        </w:rPr>
+      </w:pPr>
+      <w:r>
+        <w:rPr>
+          <w:b/>
+          <w:bCs/>
+        </w:rPr>
+        <w:t>PURPOSE</w:t>
+      </w:r>
+    </w:p>
+    <w:p>
+      <w:r>
+        <w:t>This validation step confirms:</w:t>
+      </w:r>
+    </w:p>
+    <w:p>
+      <w:pPr>
+        <w:numPr>
+          <w:ilvl w:val="0"/>
+          <w:numId w:val="10"/>
+        </w:numPr>
+      </w:pPr>
+      <w:r>
+        <w:t xml:space="preserve">successful database connectivity </w:t>
+      </w:r>
+    </w:p>
+    <w:p>
+      <w:pPr>
+        <w:numPr>
+          <w:ilvl w:val="0"/>
+          <w:numId w:val="10"/>
+        </w:numPr>
+      </w:pPr>
+      <w:r>
+        <w:t xml:space="preserve">automatic table creation </w:t>
+      </w:r>
+    </w:p>
+    <w:p>
+      <w:pPr>
+        <w:numPr>
+          <w:ilvl w:val="0"/>
+          <w:numId w:val="10"/>
+        </w:numPr>
+      </w:pPr>
+      <w:r>
+        <w:t xml:space="preserve">successful data insertion </w:t>
+      </w:r>
+    </w:p>
+    <w:p>
+      <w:pPr>
+        <w:numPr>
+          <w:ilvl w:val="0"/>
+          <w:numId w:val="10"/>
+        </w:numPr>
+      </w:pPr>
+      <w:r>
+        <w:t xml:space="preserve">readiness for large-scale data loading </w:t>
+      </w:r>
+    </w:p>
+    <w:p>
+      <w:pPr>
+        <w:rPr>
+          <w:b/>
+          <w:bCs/>
+        </w:rPr>
+      </w:pPr>
+      <w:r>
+        <w:rPr>
+          <w:b/>
+          <w:bCs/>
+        </w:rPr>
+        <w:t>CONCLUSION</w:t>
+      </w:r>
+    </w:p>
+    <w:p>
+      <w:r>
+        <w:t>The sample dataset was successfully stored in MySQL, confirming that the database environment is properly configured.</w:t>
+      </w:r>
+    </w:p>
+    <w:p>
+      <w:pPr>
+        <w:rPr>
+          <w:b/>
+          <w:bCs/>
+        </w:rPr>
+      </w:pPr>
+      <w:r>
+        <w:rPr>
+          <w:b/>
+          <w:bCs/>
+        </w:rPr>
+        <w:t xml:space="preserve">STEP </w:t>
+      </w:r>
+      <w:r>
+        <w:rPr>
+          <w:b/>
+          <w:bCs/>
+        </w:rPr>
+        <w:t>6</w:t>
+      </w:r>
+      <w:r>
+        <w:rPr>
+          <w:b/>
+          <w:bCs/>
+        </w:rPr>
+        <w:t>.5 — LOAD FRAUD RISK DATASET INTO MYSQL</w:t>
+      </w:r>
+    </w:p>
+    <w:p>
+      <w:pPr>
+        <w:rPr>
+          <w:b/>
+          <w:bCs/>
+        </w:rPr>
+      </w:pPr>
+      <w:r>
+        <w:rPr>
+          <w:b/>
+          <w:bCs/>
+        </w:rPr>
+        <w:t>OBJECTIVE</w:t>
+      </w:r>
+    </w:p>
+    <w:p>
+      <w:r>
+        <w:t>Store model-generated fraud risk scores, risk categories, and alert classifications inside MySQL for reporting and monitoring purposes.</w:t>
+      </w:r>
+    </w:p>
+    <w:p>
+      <w:pPr>
+        <w:rPr>
+          <w:b/>
+          <w:bCs/>
+        </w:rPr>
+      </w:pPr>
+      <w:r>
+        <w:rPr>
+          <w:b/>
+          <w:bCs/>
+        </w:rPr>
+        <w:t>STEPS PERFORMED</w:t>
+      </w:r>
+    </w:p>
+    <w:p>
+      <w:pPr>
+        <w:numPr>
+          <w:ilvl w:val="0"/>
+          <w:numId w:val="11"/>
+        </w:numPr>
+      </w:pPr>
+      <w:r>
+        <w:t xml:space="preserve">Loaded the complete fraud_risk_scores.csv dataset into MySQL </w:t>
+      </w:r>
+    </w:p>
+    <w:p>
+      <w:pPr>
+        <w:numPr>
+          <w:ilvl w:val="0"/>
+          <w:numId w:val="11"/>
+        </w:numPr>
+      </w:pPr>
+      <w:r>
+        <w:t xml:space="preserve">Automatically created the </w:t>
+      </w:r>
+      <w:proofErr w:type="spellStart"/>
+      <w:r>
+        <w:t>fraud_risk_scores</w:t>
+      </w:r>
+      <w:proofErr w:type="spellEnd"/>
+      <w:r>
+        <w:t xml:space="preserve"> table </w:t>
+      </w:r>
+    </w:p>
+    <w:p>
+      <w:pPr>
+        <w:numPr>
+          <w:ilvl w:val="0"/>
+          <w:numId w:val="11"/>
+        </w:numPr>
+      </w:pPr>
+      <w:r>
+        <w:t xml:space="preserve">Inserted all fraud risk records </w:t>
+      </w:r>
+    </w:p>
+    <w:p>
+      <w:pPr>
+        <w:numPr>
+          <w:ilvl w:val="0"/>
+          <w:numId w:val="11"/>
+        </w:numPr>
+      </w:pPr>
+      <w:r>
+        <w:t xml:space="preserve">Verified successful data loading using SQL row count validation </w:t>
+      </w:r>
+    </w:p>
+    <w:p>
+      <w:pPr>
+        <w:rPr>
+          <w:b/>
+          <w:bCs/>
+        </w:rPr>
+      </w:pPr>
+      <w:r>
+        <w:rPr>
+          <w:b/>
+          <w:bCs/>
+        </w:rPr>
+        <w:t>VERIFICATION</w:t>
+      </w:r>
+    </w:p>
+    <w:p>
+      <w:r>
+        <w:t xml:space="preserve">Table Name: </w:t>
+      </w:r>
+      <w:proofErr w:type="spellStart"/>
+      <w:r>
+        <w:t>fraud_risk_scores</w:t>
+      </w:r>
+      <w:proofErr w:type="spellEnd"/>
+      <w:r>
+        <w:br/>
+        <w:t>Rows Loaded: 370,479</w:t>
+      </w:r>
+    </w:p>
+    <w:p>
+      <w:pPr>
+        <w:rPr>
+          <w:b/>
+          <w:bCs/>
+        </w:rPr>
+      </w:pPr>
+      <w:r>
+        <w:rPr>
+          <w:b/>
+          <w:bCs/>
+        </w:rPr>
+        <w:t>PURPOSE</w:t>
+      </w:r>
+    </w:p>
+    <w:p>
+      <w:r>
+        <w:lastRenderedPageBreak/>
+        <w:t>The fraud risk table provides a centralized repository for:</w:t>
+      </w:r>
+    </w:p>
+    <w:p>
+      <w:pPr>
+        <w:numPr>
+          <w:ilvl w:val="0"/>
+          <w:numId w:val="12"/>
+        </w:numPr>
+      </w:pPr>
+      <w:r>
+        <w:t xml:space="preserve">fraud probability scores </w:t>
+      </w:r>
+    </w:p>
+    <w:p>
+      <w:pPr>
+        <w:numPr>
+          <w:ilvl w:val="0"/>
+          <w:numId w:val="12"/>
+        </w:numPr>
+      </w:pPr>
+      <w:r>
+        <w:t xml:space="preserve">risk categories </w:t>
+      </w:r>
+    </w:p>
+    <w:p>
+      <w:pPr>
+        <w:numPr>
+          <w:ilvl w:val="0"/>
+          <w:numId w:val="12"/>
+        </w:numPr>
+      </w:pPr>
+      <w:r>
+        <w:t xml:space="preserve">fraud alerts </w:t>
+      </w:r>
+    </w:p>
+    <w:p>
+      <w:pPr>
+        <w:numPr>
+          <w:ilvl w:val="0"/>
+          <w:numId w:val="12"/>
+        </w:numPr>
+      </w:pPr>
+      <w:r>
+        <w:t xml:space="preserve">future KPI reporting </w:t>
+      </w:r>
+    </w:p>
+    <w:p>
+      <w:pPr>
+        <w:numPr>
+          <w:ilvl w:val="0"/>
+          <w:numId w:val="12"/>
+        </w:numPr>
+      </w:pPr>
+      <w:r>
+        <w:t xml:space="preserve">dashboard integration </w:t>
+      </w:r>
+    </w:p>
+    <w:p>
+      <w:pPr>
+        <w:rPr>
+          <w:b/>
+          <w:bCs/>
+        </w:rPr>
+      </w:pPr>
+      <w:r>
+        <w:rPr>
+          <w:b/>
+          <w:bCs/>
+        </w:rPr>
+        <w:t>CONCLUSION</w:t>
+      </w:r>
+    </w:p>
+    <w:p>
+      <w:r>
+        <w:t>The fraud risk dataset was successfully stored in MySQL and is now available for SQL analytics and reporting.</w:t>
+      </w:r>
+    </w:p>
+    <w:p>
+      <w:pPr>
+        <w:rPr>
+          <w:b/>
+          <w:bCs/>
+        </w:rPr>
+      </w:pPr>
+      <w:r>
+        <w:rPr>
+          <w:b/>
+          <w:bCs/>
+        </w:rPr>
+        <w:t>STEP 3.6 — LOAD FULL TRANSACTION DATASET INTO MYSQL</w:t>
+      </w:r>
+    </w:p>
+    <w:p>
+      <w:pPr>
+        <w:rPr>
+          <w:b/>
+          <w:bCs/>
+        </w:rPr>
+      </w:pPr>
+      <w:r>
+        <w:rPr>
+          <w:b/>
+          <w:bCs/>
+        </w:rPr>
+        <w:t>OBJECTIVE</w:t>
+      </w:r>
+    </w:p>
+    <w:p>
+      <w:r>
+        <w:t>Store the complete transaction dataset inside MySQL to enable SQL analytics, KPI reporting, dashboard development, and fraud monitoring.</w:t>
+      </w:r>
+    </w:p>
+    <w:p>
+      <w:pPr>
+        <w:rPr>
+          <w:b/>
+          <w:bCs/>
+        </w:rPr>
+      </w:pPr>
+      <w:r>
+        <w:rPr>
+          <w:b/>
+          <w:bCs/>
+        </w:rPr>
+        <w:t>STEPS PERFORMED</w:t>
+      </w:r>
+    </w:p>
+    <w:p>
+      <w:pPr>
+        <w:rPr>
+          <w:b/>
+          <w:bCs/>
+        </w:rPr>
+      </w:pPr>
+      <w:r>
+        <w:rPr>
+          <w:b/>
+          <w:bCs/>
+        </w:rPr>
+        <w:t>Prepare Transaction Dataset</w:t>
+      </w:r>
+    </w:p>
+    <w:p>
+      <w:r>
+        <w:t>Loaded the final transaction dataset containing customer, merchant, geographic, and fraud-related information.</w:t>
+      </w:r>
+    </w:p>
+    <w:p>
+      <w:pPr>
+        <w:rPr>
+          <w:b/>
+          <w:bCs/>
+        </w:rPr>
+      </w:pPr>
+      <w:r>
+        <w:rPr>
+          <w:b/>
+          <w:bCs/>
+        </w:rPr>
+        <w:t>Implement Chunk-Based Loading</w:t>
+      </w:r>
+    </w:p>
+    <w:p>
+      <w:r>
+        <w:t>Due to the large dataset size, records were loaded into MySQL in smaller batches.</w:t>
+      </w:r>
+      <w:r>
+        <w:t xml:space="preserve"> </w:t>
+      </w:r>
+      <w:r>
+        <w:t>A chunk-loading strategy was implemented to:</w:t>
+      </w:r>
+    </w:p>
+    <w:p>
+      <w:pPr>
+        <w:numPr>
+          <w:ilvl w:val="0"/>
+          <w:numId w:val="13"/>
+        </w:numPr>
+      </w:pPr>
+      <w:r>
+        <w:t xml:space="preserve">reduce memory consumption </w:t>
+      </w:r>
+    </w:p>
+    <w:p>
+      <w:pPr>
+        <w:numPr>
+          <w:ilvl w:val="0"/>
+          <w:numId w:val="13"/>
+        </w:numPr>
+      </w:pPr>
+      <w:r>
+        <w:t xml:space="preserve">prevent system freezing </w:t>
+      </w:r>
+    </w:p>
+    <w:p>
+      <w:pPr>
+        <w:numPr>
+          <w:ilvl w:val="0"/>
+          <w:numId w:val="13"/>
+        </w:numPr>
+      </w:pPr>
+      <w:r>
+        <w:t xml:space="preserve">improve loading reliability </w:t>
+      </w:r>
+    </w:p>
+    <w:p>
+      <w:pPr>
+        <w:numPr>
+          <w:ilvl w:val="0"/>
+          <w:numId w:val="13"/>
+        </w:numPr>
+      </w:pPr>
+      <w:r>
+        <w:t xml:space="preserve">handle large-scale data efficiently </w:t>
+      </w:r>
+    </w:p>
+    <w:p>
+      <w:pPr>
+        <w:rPr>
+          <w:b/>
+          <w:bCs/>
+        </w:rPr>
+      </w:pPr>
+      <w:r>
+        <w:rPr>
+          <w:b/>
+          <w:bCs/>
+        </w:rPr>
+        <w:t>Replace Sample Table</w:t>
+      </w:r>
+    </w:p>
+    <w:p>
+      <w:pPr>
+        <w:rPr>
+          <w:b/>
+          <w:bCs/>
+        </w:rPr>
+      </w:pPr>
+      <w:r>
+        <w:t>The temporary sample table created during validation was replaced with the full production dataset.</w:t>
+      </w:r>
+    </w:p>
+    <w:p>
+      <w:pPr>
+        <w:rPr>
+          <w:b/>
+          <w:bCs/>
+        </w:rPr>
+      </w:pPr>
+      <w:r>
+        <w:rPr>
+          <w:b/>
+          <w:bCs/>
+        </w:rPr>
+        <w:t>Insert Complete Dataset</w:t>
+      </w:r>
+    </w:p>
+    <w:p>
+      <w:r>
+        <w:t>All transaction records were successfully inserted into</w:t>
+      </w:r>
+      <w:r>
+        <w:t xml:space="preserve"> </w:t>
+      </w:r>
+      <w:proofErr w:type="spellStart"/>
+      <w:r>
+        <w:t>transactions_master</w:t>
+      </w:r>
+      <w:proofErr w:type="spellEnd"/>
+      <w:r>
+        <w:t>.</w:t>
+      </w:r>
+    </w:p>
+    <w:p>
+      <w:pPr>
+        <w:rPr>
+          <w:b/>
+          <w:bCs/>
+        </w:rPr>
+      </w:pPr>
+      <w:r>
+        <w:rPr>
+          <w:b/>
+          <w:bCs/>
+        </w:rPr>
+        <w:lastRenderedPageBreak/>
+        <w:t>Validate Successful Loading</w:t>
+      </w:r>
+    </w:p>
+    <w:p>
+      <w:r>
+        <w:t>Executed SQL validation queries to confirm successful data insertion.</w:t>
+      </w:r>
+    </w:p>
+    <w:p>
+      <w:pPr>
+        <w:rPr>
+          <w:b/>
+          <w:bCs/>
+        </w:rPr>
+      </w:pPr>
+      <w:r>
+        <w:rPr>
+          <w:b/>
+          <w:bCs/>
+        </w:rPr>
+        <w:t>PURPOSE</w:t>
+      </w:r>
+    </w:p>
+    <w:p>
+      <w:r>
+        <w:t>The transaction table serves as the primary source for</w:t>
+      </w:r>
+      <w:r>
+        <w:t xml:space="preserve"> </w:t>
+      </w:r>
+      <w:r>
+        <w:t>fraud analytics</w:t>
+      </w:r>
+      <w:r>
+        <w:t xml:space="preserve">, </w:t>
+      </w:r>
+      <w:r>
+        <w:t>KPI reporting</w:t>
+      </w:r>
+      <w:r>
+        <w:t xml:space="preserve">, </w:t>
+      </w:r>
+      <w:r>
+        <w:t>SQL investigations</w:t>
+      </w:r>
+      <w:r>
+        <w:t xml:space="preserve">, </w:t>
+      </w:r>
+      <w:r>
+        <w:t>Power BI dashboards</w:t>
+      </w:r>
+      <w:r>
+        <w:t xml:space="preserve">, and </w:t>
+      </w:r>
+      <w:r>
+        <w:t>operational monitoring</w:t>
+      </w:r>
+      <w:r>
+        <w:t>.</w:t>
+      </w:r>
+    </w:p>
+    <w:p>
+      <w:pPr>
+        <w:rPr>
+          <w:b/>
+          <w:bCs/>
+        </w:rPr>
+      </w:pPr>
+      <w:r>
+        <w:rPr>
+          <w:b/>
+          <w:bCs/>
+        </w:rPr>
+        <w:t>CONCLUSION</w:t>
+      </w:r>
+    </w:p>
+    <w:p>
+      <w:r>
+        <w:t>The complete transaction dataset was successfully stored in MySQL and is now available for SQL-based analysis and reporting.</w:t>
+      </w:r>
+    </w:p>
+    <w:p/>
     <w:p/>
     <w:sectPr>
       <w:pgSz w:w="11906" w:h="16838"/>
@@ -781,6 +1548,304 @@
 <file path=word/numbering.xml><?xml version="1.0" encoding="utf-8"?>
 <w:numbering xmlns:wpc="http://schemas.microsoft.com/office/word/2010/wordprocessingCanvas" xmlns:cx="http://schemas.microsoft.com/office/drawing/2014/chartex" xmlns:cx1="http://schemas.microsoft.com/office/drawing/2015/9/8/chartex" xmlns:cx2="http://schemas.microsoft.com/office/drawing/2015/10/21/chartex" xmlns:cx3="http://schemas.microsoft.com/office/drawing/2016/5/9/chartex" xmlns:cx4="http://schemas.microsoft.com/office/drawing/2016/5/10/chartex" xmlns:cx5="http://schemas.microsoft.com/office/drawing/2016/5/11/chartex" xmlns:cx6="http://schemas.microsoft.com/office/drawing/2016/5/12/chartex" xmlns:cx7="http://schemas.microsoft.com/office/drawing/2016/5/13/chartex" xmlns:cx8="http://schemas.microsoft.com/office/drawing/2016/5/14/chartex" xmlns:mc="http://schemas.openxmlformats.org/markup-compatibility/2006" xmlns:aink="http://schemas.microsoft.com/office/drawing/2016/ink" xmlns:am3d="http://schemas.microsoft.com/office/drawing/2017/model3d" xmlns:o="urn:schemas-microsoft-com:office:office" xmlns:oel="http://schemas.microsoft.com/office/2019/extlst" xmlns:r="http://schemas.openxmlformats.org/officeDocument/2006/relationships" xmlns:m="http://schemas.openxmlformats.org/officeDocument/2006/math" xmlns:v="urn:schemas-microsoft-com:vml" xmlns:wp14="http://schemas.microsoft.com/office/word/2010/wordprocessingDrawing" xmlns:wp="http://schemas.openxmlformats.org/drawingml/2006/wordprocessingDrawing" xmlns:w10="urn:schemas-microsoft-com:office:word" xmlns:w="http://schemas.openxmlformats.org/wordprocessingml/2006/main" xmlns:w14="http://schemas.microsoft.com/office/word/2010/wordml" xmlns:w15="http://schemas.microsoft.com/office/word/2012/wordml" xmlns:w16cex="http://schemas.microsoft.com/office/word/2018/wordml/cex" xmlns:w16cid="http://schemas.microsoft.com/office/word/2016/wordml/cid" xmlns:w16="http://schemas.microsoft.com/office/word/2018/wordml" xmlns:w16du="http://schemas.microsoft.com/office/word/2023/wordml/word16du" xmlns:w16sdtdh="http://schemas.microsoft.com/office/word/2020/wordml/sdtdatahash" xmlns:w16sdtfl="http://schemas.microsoft.com/office/word/2024/wordml/sdtformatlock" xmlns:w16se="http://schemas.microsoft.com/office/word/2015/wordml/symex" xmlns:wpg="http://schemas.microsoft.com/office/word/2010/wordprocessingGroup" xmlns:wpi="http://schemas.microsoft.com/office/word/2010/wordprocessingInk" xmlns:wne="http://schemas.microsoft.com/office/word/2006/wordml" xmlns:wps="http://schemas.microsoft.com/office/word/2010/wordprocessingShape" mc:Ignorable="w14 w15 w16se w16cid w16 w16cex w16sdtdh w16sdtfl w16du wp14">
   <w:abstractNum w:abstractNumId="0" w15:restartNumberingAfterBreak="0">
+    <w:nsid w:val="03742EC0"/>
+    <w:multiLevelType w:val="multilevel"/>
+    <w:tmpl w:val="4A1EAE56"/>
+    <w:lvl w:ilvl="0">
+      <w:start w:val="1"/>
+      <w:numFmt w:val="bullet"/>
+      <w:lvlText w:val=""/>
+      <w:lvlJc w:val="left"/>
+      <w:pPr>
+        <w:tabs>
+          <w:tab w:val="num" w:pos="720"/>
+        </w:tabs>
+        <w:ind w:left="720" w:hanging="360"/>
+      </w:pPr>
+      <w:rPr>
+        <w:rFonts w:ascii="Symbol" w:hAnsi="Symbol" w:hint="default"/>
+        <w:sz w:val="20"/>
+      </w:rPr>
+    </w:lvl>
+    <w:lvl w:ilvl="1" w:tentative="1">
+      <w:start w:val="1"/>
+      <w:numFmt w:val="bullet"/>
+      <w:lvlText w:val="o"/>
+      <w:lvlJc w:val="left"/>
+      <w:pPr>
+        <w:tabs>
+          <w:tab w:val="num" w:pos="1440"/>
+        </w:tabs>
+        <w:ind w:left="1440" w:hanging="360"/>
+      </w:pPr>
+      <w:rPr>
+        <w:rFonts w:ascii="Courier New" w:hAnsi="Courier New" w:hint="default"/>
+        <w:sz w:val="20"/>
+      </w:rPr>
+    </w:lvl>
+    <w:lvl w:ilvl="2" w:tentative="1">
+      <w:start w:val="1"/>
+      <w:numFmt w:val="bullet"/>
+      <w:lvlText w:val=""/>
+      <w:lvlJc w:val="left"/>
+      <w:pPr>
+        <w:tabs>
+          <w:tab w:val="num" w:pos="2160"/>
+        </w:tabs>
+        <w:ind w:left="2160" w:hanging="360"/>
+      </w:pPr>
+      <w:rPr>
+        <w:rFonts w:ascii="Wingdings" w:hAnsi="Wingdings" w:hint="default"/>
+        <w:sz w:val="20"/>
+      </w:rPr>
+    </w:lvl>
+    <w:lvl w:ilvl="3" w:tentative="1">
+      <w:start w:val="1"/>
+      <w:numFmt w:val="bullet"/>
+      <w:lvlText w:val=""/>
+      <w:lvlJc w:val="left"/>
+      <w:pPr>
+        <w:tabs>
+          <w:tab w:val="num" w:pos="2880"/>
+        </w:tabs>
+        <w:ind w:left="2880" w:hanging="360"/>
+      </w:pPr>
+      <w:rPr>
+        <w:rFonts w:ascii="Wingdings" w:hAnsi="Wingdings" w:hint="default"/>
+        <w:sz w:val="20"/>
+      </w:rPr>
+    </w:lvl>
+    <w:lvl w:ilvl="4" w:tentative="1">
+      <w:start w:val="1"/>
+      <w:numFmt w:val="bullet"/>
+      <w:lvlText w:val=""/>
+      <w:lvlJc w:val="left"/>
+      <w:pPr>
+        <w:tabs>
+          <w:tab w:val="num" w:pos="3600"/>
+        </w:tabs>
+        <w:ind w:left="3600" w:hanging="360"/>
+      </w:pPr>
+      <w:rPr>
+        <w:rFonts w:ascii="Wingdings" w:hAnsi="Wingdings" w:hint="default"/>
+        <w:sz w:val="20"/>
+      </w:rPr>
+    </w:lvl>
+    <w:lvl w:ilvl="5" w:tentative="1">
+      <w:start w:val="1"/>
+      <w:numFmt w:val="bullet"/>
+      <w:lvlText w:val=""/>
+      <w:lvlJc w:val="left"/>
+      <w:pPr>
+        <w:tabs>
+          <w:tab w:val="num" w:pos="4320"/>
+        </w:tabs>
+        <w:ind w:left="4320" w:hanging="360"/>
+      </w:pPr>
+      <w:rPr>
+        <w:rFonts w:ascii="Wingdings" w:hAnsi="Wingdings" w:hint="default"/>
+        <w:sz w:val="20"/>
+      </w:rPr>
+    </w:lvl>
+    <w:lvl w:ilvl="6" w:tentative="1">
+      <w:start w:val="1"/>
+      <w:numFmt w:val="bullet"/>
+      <w:lvlText w:val=""/>
+      <w:lvlJc w:val="left"/>
+      <w:pPr>
+        <w:tabs>
+          <w:tab w:val="num" w:pos="5040"/>
+        </w:tabs>
+        <w:ind w:left="5040" w:hanging="360"/>
+      </w:pPr>
+      <w:rPr>
+        <w:rFonts w:ascii="Wingdings" w:hAnsi="Wingdings" w:hint="default"/>
+        <w:sz w:val="20"/>
+      </w:rPr>
+    </w:lvl>
+    <w:lvl w:ilvl="7" w:tentative="1">
+      <w:start w:val="1"/>
+      <w:numFmt w:val="bullet"/>
+      <w:lvlText w:val=""/>
+      <w:lvlJc w:val="left"/>
+      <w:pPr>
+        <w:tabs>
+          <w:tab w:val="num" w:pos="5760"/>
+        </w:tabs>
+        <w:ind w:left="5760" w:hanging="360"/>
+      </w:pPr>
+      <w:rPr>
+        <w:rFonts w:ascii="Wingdings" w:hAnsi="Wingdings" w:hint="default"/>
+        <w:sz w:val="20"/>
+      </w:rPr>
+    </w:lvl>
+    <w:lvl w:ilvl="8" w:tentative="1">
+      <w:start w:val="1"/>
+      <w:numFmt w:val="bullet"/>
+      <w:lvlText w:val=""/>
+      <w:lvlJc w:val="left"/>
+      <w:pPr>
+        <w:tabs>
+          <w:tab w:val="num" w:pos="6480"/>
+        </w:tabs>
+        <w:ind w:left="6480" w:hanging="360"/>
+      </w:pPr>
+      <w:rPr>
+        <w:rFonts w:ascii="Wingdings" w:hAnsi="Wingdings" w:hint="default"/>
+        <w:sz w:val="20"/>
+      </w:rPr>
+    </w:lvl>
+  </w:abstractNum>
+  <w:abstractNum w:abstractNumId="1" w15:restartNumberingAfterBreak="0">
+    <w:nsid w:val="03D52010"/>
+    <w:multiLevelType w:val="multilevel"/>
+    <w:tmpl w:val="7F24FA6E"/>
+    <w:lvl w:ilvl="0">
+      <w:start w:val="1"/>
+      <w:numFmt w:val="bullet"/>
+      <w:lvlText w:val=""/>
+      <w:lvlJc w:val="left"/>
+      <w:pPr>
+        <w:tabs>
+          <w:tab w:val="num" w:pos="720"/>
+        </w:tabs>
+        <w:ind w:left="720" w:hanging="360"/>
+      </w:pPr>
+      <w:rPr>
+        <w:rFonts w:ascii="Symbol" w:hAnsi="Symbol" w:hint="default"/>
+        <w:sz w:val="20"/>
+      </w:rPr>
+    </w:lvl>
+    <w:lvl w:ilvl="1" w:tentative="1">
+      <w:start w:val="1"/>
+      <w:numFmt w:val="bullet"/>
+      <w:lvlText w:val="o"/>
+      <w:lvlJc w:val="left"/>
+      <w:pPr>
+        <w:tabs>
+          <w:tab w:val="num" w:pos="1440"/>
+        </w:tabs>
+        <w:ind w:left="1440" w:hanging="360"/>
+      </w:pPr>
+      <w:rPr>
+        <w:rFonts w:ascii="Courier New" w:hAnsi="Courier New" w:hint="default"/>
+        <w:sz w:val="20"/>
+      </w:rPr>
+    </w:lvl>
+    <w:lvl w:ilvl="2" w:tentative="1">
+      <w:start w:val="1"/>
+      <w:numFmt w:val="bullet"/>
+      <w:lvlText w:val=""/>
+      <w:lvlJc w:val="left"/>
+      <w:pPr>
+        <w:tabs>
+          <w:tab w:val="num" w:pos="2160"/>
+        </w:tabs>
+        <w:ind w:left="2160" w:hanging="360"/>
+      </w:pPr>
+      <w:rPr>
+        <w:rFonts w:ascii="Wingdings" w:hAnsi="Wingdings" w:hint="default"/>
+        <w:sz w:val="20"/>
+      </w:rPr>
+    </w:lvl>
+    <w:lvl w:ilvl="3" w:tentative="1">
+      <w:start w:val="1"/>
+      <w:numFmt w:val="bullet"/>
+      <w:lvlText w:val=""/>
+      <w:lvlJc w:val="left"/>
+      <w:pPr>
+        <w:tabs>
+          <w:tab w:val="num" w:pos="2880"/>
+        </w:tabs>
+        <w:ind w:left="2880" w:hanging="360"/>
+      </w:pPr>
+      <w:rPr>
+        <w:rFonts w:ascii="Wingdings" w:hAnsi="Wingdings" w:hint="default"/>
+        <w:sz w:val="20"/>
+      </w:rPr>
+    </w:lvl>
+    <w:lvl w:ilvl="4" w:tentative="1">
+      <w:start w:val="1"/>
+      <w:numFmt w:val="bullet"/>
+      <w:lvlText w:val=""/>
+      <w:lvlJc w:val="left"/>
+      <w:pPr>
+        <w:tabs>
+          <w:tab w:val="num" w:pos="3600"/>
+        </w:tabs>
+        <w:ind w:left="3600" w:hanging="360"/>
+      </w:pPr>
+      <w:rPr>
+        <w:rFonts w:ascii="Wingdings" w:hAnsi="Wingdings" w:hint="default"/>
+        <w:sz w:val="20"/>
+      </w:rPr>
+    </w:lvl>
+    <w:lvl w:ilvl="5" w:tentative="1">
+      <w:start w:val="1"/>
+      <w:numFmt w:val="bullet"/>
+      <w:lvlText w:val=""/>
+      <w:lvlJc w:val="left"/>
+      <w:pPr>
+        <w:tabs>
+          <w:tab w:val="num" w:pos="4320"/>
+        </w:tabs>
+        <w:ind w:left="4320" w:hanging="360"/>
+      </w:pPr>
+      <w:rPr>
+        <w:rFonts w:ascii="Wingdings" w:hAnsi="Wingdings" w:hint="default"/>
+        <w:sz w:val="20"/>
+      </w:rPr>
+    </w:lvl>
+    <w:lvl w:ilvl="6" w:tentative="1">
+      <w:start w:val="1"/>
+      <w:numFmt w:val="bullet"/>
+      <w:lvlText w:val=""/>
+      <w:lvlJc w:val="left"/>
+      <w:pPr>
+        <w:tabs>
+          <w:tab w:val="num" w:pos="5040"/>
+        </w:tabs>
+        <w:ind w:left="5040" w:hanging="360"/>
+      </w:pPr>
+      <w:rPr>
+        <w:rFonts w:ascii="Wingdings" w:hAnsi="Wingdings" w:hint="default"/>
+        <w:sz w:val="20"/>
+      </w:rPr>
+    </w:lvl>
+    <w:lvl w:ilvl="7" w:tentative="1">
+      <w:start w:val="1"/>
+      <w:numFmt w:val="bullet"/>
+      <w:lvlText w:val=""/>
+      <w:lvlJc w:val="left"/>
+      <w:pPr>
+        <w:tabs>
+          <w:tab w:val="num" w:pos="5760"/>
+        </w:tabs>
+        <w:ind w:left="5760" w:hanging="360"/>
+      </w:pPr>
+      <w:rPr>
+        <w:rFonts w:ascii="Wingdings" w:hAnsi="Wingdings" w:hint="default"/>
+        <w:sz w:val="20"/>
+      </w:rPr>
+    </w:lvl>
+    <w:lvl w:ilvl="8" w:tentative="1">
+      <w:start w:val="1"/>
+      <w:numFmt w:val="bullet"/>
+      <w:lvlText w:val=""/>
+      <w:lvlJc w:val="left"/>
+      <w:pPr>
+        <w:tabs>
+          <w:tab w:val="num" w:pos="6480"/>
+        </w:tabs>
+        <w:ind w:left="6480" w:hanging="360"/>
+      </w:pPr>
+      <w:rPr>
+        <w:rFonts w:ascii="Wingdings" w:hAnsi="Wingdings" w:hint="default"/>
+        <w:sz w:val="20"/>
+      </w:rPr>
+    </w:lvl>
+  </w:abstractNum>
+  <w:abstractNum w:abstractNumId="2" w15:restartNumberingAfterBreak="0">
     <w:nsid w:val="08F426B0"/>
     <w:multiLevelType w:val="multilevel"/>
     <w:tmpl w:val="E2128C68"/>
@@ -929,7 +1994,7 @@
       </w:rPr>
     </w:lvl>
   </w:abstractNum>
-  <w:abstractNum w:abstractNumId="1" w15:restartNumberingAfterBreak="0">
+  <w:abstractNum w:abstractNumId="3" w15:restartNumberingAfterBreak="0">
     <w:nsid w:val="0E7A1CDC"/>
     <w:multiLevelType w:val="multilevel"/>
     <w:tmpl w:val="C31ED038"/>
@@ -1078,7 +2143,7 @@
       </w:rPr>
     </w:lvl>
   </w:abstractNum>
-  <w:abstractNum w:abstractNumId="2" w15:restartNumberingAfterBreak="0">
+  <w:abstractNum w:abstractNumId="4" w15:restartNumberingAfterBreak="0">
     <w:nsid w:val="176D5D49"/>
     <w:multiLevelType w:val="multilevel"/>
     <w:tmpl w:val="E368BA6A"/>
@@ -1227,7 +2292,454 @@
       </w:rPr>
     </w:lvl>
   </w:abstractNum>
-  <w:abstractNum w:abstractNumId="3" w15:restartNumberingAfterBreak="0">
+  <w:abstractNum w:abstractNumId="5" w15:restartNumberingAfterBreak="0">
+    <w:nsid w:val="29501B54"/>
+    <w:multiLevelType w:val="multilevel"/>
+    <w:tmpl w:val="1C02E354"/>
+    <w:lvl w:ilvl="0">
+      <w:start w:val="1"/>
+      <w:numFmt w:val="bullet"/>
+      <w:lvlText w:val=""/>
+      <w:lvlJc w:val="left"/>
+      <w:pPr>
+        <w:tabs>
+          <w:tab w:val="num" w:pos="720"/>
+        </w:tabs>
+        <w:ind w:left="720" w:hanging="360"/>
+      </w:pPr>
+      <w:rPr>
+        <w:rFonts w:ascii="Symbol" w:hAnsi="Symbol" w:hint="default"/>
+        <w:sz w:val="20"/>
+      </w:rPr>
+    </w:lvl>
+    <w:lvl w:ilvl="1" w:tentative="1">
+      <w:start w:val="1"/>
+      <w:numFmt w:val="bullet"/>
+      <w:lvlText w:val="o"/>
+      <w:lvlJc w:val="left"/>
+      <w:pPr>
+        <w:tabs>
+          <w:tab w:val="num" w:pos="1440"/>
+        </w:tabs>
+        <w:ind w:left="1440" w:hanging="360"/>
+      </w:pPr>
+      <w:rPr>
+        <w:rFonts w:ascii="Courier New" w:hAnsi="Courier New" w:hint="default"/>
+        <w:sz w:val="20"/>
+      </w:rPr>
+    </w:lvl>
+    <w:lvl w:ilvl="2" w:tentative="1">
+      <w:start w:val="1"/>
+      <w:numFmt w:val="bullet"/>
+      <w:lvlText w:val=""/>
+      <w:lvlJc w:val="left"/>
+      <w:pPr>
+        <w:tabs>
+          <w:tab w:val="num" w:pos="2160"/>
+        </w:tabs>
+        <w:ind w:left="2160" w:hanging="360"/>
+      </w:pPr>
+      <w:rPr>
+        <w:rFonts w:ascii="Wingdings" w:hAnsi="Wingdings" w:hint="default"/>
+        <w:sz w:val="20"/>
+      </w:rPr>
+    </w:lvl>
+    <w:lvl w:ilvl="3" w:tentative="1">
+      <w:start w:val="1"/>
+      <w:numFmt w:val="bullet"/>
+      <w:lvlText w:val=""/>
+      <w:lvlJc w:val="left"/>
+      <w:pPr>
+        <w:tabs>
+          <w:tab w:val="num" w:pos="2880"/>
+        </w:tabs>
+        <w:ind w:left="2880" w:hanging="360"/>
+      </w:pPr>
+      <w:rPr>
+        <w:rFonts w:ascii="Wingdings" w:hAnsi="Wingdings" w:hint="default"/>
+        <w:sz w:val="20"/>
+      </w:rPr>
+    </w:lvl>
+    <w:lvl w:ilvl="4" w:tentative="1">
+      <w:start w:val="1"/>
+      <w:numFmt w:val="bullet"/>
+      <w:lvlText w:val=""/>
+      <w:lvlJc w:val="left"/>
+      <w:pPr>
+        <w:tabs>
+          <w:tab w:val="num" w:pos="3600"/>
+        </w:tabs>
+        <w:ind w:left="3600" w:hanging="360"/>
+      </w:pPr>
+      <w:rPr>
+        <w:rFonts w:ascii="Wingdings" w:hAnsi="Wingdings" w:hint="default"/>
+        <w:sz w:val="20"/>
+      </w:rPr>
+    </w:lvl>
+    <w:lvl w:ilvl="5" w:tentative="1">
+      <w:start w:val="1"/>
+      <w:numFmt w:val="bullet"/>
+      <w:lvlText w:val=""/>
+      <w:lvlJc w:val="left"/>
+      <w:pPr>
+        <w:tabs>
+          <w:tab w:val="num" w:pos="4320"/>
+        </w:tabs>
+        <w:ind w:left="4320" w:hanging="360"/>
+      </w:pPr>
+      <w:rPr>
+        <w:rFonts w:ascii="Wingdings" w:hAnsi="Wingdings" w:hint="default"/>
+        <w:sz w:val="20"/>
+      </w:rPr>
+    </w:lvl>
+    <w:lvl w:ilvl="6" w:tentative="1">
+      <w:start w:val="1"/>
+      <w:numFmt w:val="bullet"/>
+      <w:lvlText w:val=""/>
+      <w:lvlJc w:val="left"/>
+      <w:pPr>
+        <w:tabs>
+          <w:tab w:val="num" w:pos="5040"/>
+        </w:tabs>
+        <w:ind w:left="5040" w:hanging="360"/>
+      </w:pPr>
+      <w:rPr>
+        <w:rFonts w:ascii="Wingdings" w:hAnsi="Wingdings" w:hint="default"/>
+        <w:sz w:val="20"/>
+      </w:rPr>
+    </w:lvl>
+    <w:lvl w:ilvl="7" w:tentative="1">
+      <w:start w:val="1"/>
+      <w:numFmt w:val="bullet"/>
+      <w:lvlText w:val=""/>
+      <w:lvlJc w:val="left"/>
+      <w:pPr>
+        <w:tabs>
+          <w:tab w:val="num" w:pos="5760"/>
+        </w:tabs>
+        <w:ind w:left="5760" w:hanging="360"/>
+      </w:pPr>
+      <w:rPr>
+        <w:rFonts w:ascii="Wingdings" w:hAnsi="Wingdings" w:hint="default"/>
+        <w:sz w:val="20"/>
+      </w:rPr>
+    </w:lvl>
+    <w:lvl w:ilvl="8" w:tentative="1">
+      <w:start w:val="1"/>
+      <w:numFmt w:val="bullet"/>
+      <w:lvlText w:val=""/>
+      <w:lvlJc w:val="left"/>
+      <w:pPr>
+        <w:tabs>
+          <w:tab w:val="num" w:pos="6480"/>
+        </w:tabs>
+        <w:ind w:left="6480" w:hanging="360"/>
+      </w:pPr>
+      <w:rPr>
+        <w:rFonts w:ascii="Wingdings" w:hAnsi="Wingdings" w:hint="default"/>
+        <w:sz w:val="20"/>
+      </w:rPr>
+    </w:lvl>
+  </w:abstractNum>
+  <w:abstractNum w:abstractNumId="6" w15:restartNumberingAfterBreak="0">
+    <w:nsid w:val="3FD9234A"/>
+    <w:multiLevelType w:val="multilevel"/>
+    <w:tmpl w:val="10863556"/>
+    <w:lvl w:ilvl="0">
+      <w:start w:val="1"/>
+      <w:numFmt w:val="bullet"/>
+      <w:lvlText w:val=""/>
+      <w:lvlJc w:val="left"/>
+      <w:pPr>
+        <w:tabs>
+          <w:tab w:val="num" w:pos="720"/>
+        </w:tabs>
+        <w:ind w:left="720" w:hanging="360"/>
+      </w:pPr>
+      <w:rPr>
+        <w:rFonts w:ascii="Symbol" w:hAnsi="Symbol" w:hint="default"/>
+        <w:sz w:val="20"/>
+      </w:rPr>
+    </w:lvl>
+    <w:lvl w:ilvl="1" w:tentative="1">
+      <w:start w:val="1"/>
+      <w:numFmt w:val="bullet"/>
+      <w:lvlText w:val="o"/>
+      <w:lvlJc w:val="left"/>
+      <w:pPr>
+        <w:tabs>
+          <w:tab w:val="num" w:pos="1440"/>
+        </w:tabs>
+        <w:ind w:left="1440" w:hanging="360"/>
+      </w:pPr>
+      <w:rPr>
+        <w:rFonts w:ascii="Courier New" w:hAnsi="Courier New" w:hint="default"/>
+        <w:sz w:val="20"/>
+      </w:rPr>
+    </w:lvl>
+    <w:lvl w:ilvl="2" w:tentative="1">
+      <w:start w:val="1"/>
+      <w:numFmt w:val="bullet"/>
+      <w:lvlText w:val=""/>
+      <w:lvlJc w:val="left"/>
+      <w:pPr>
+        <w:tabs>
+          <w:tab w:val="num" w:pos="2160"/>
+        </w:tabs>
+        <w:ind w:left="2160" w:hanging="360"/>
+      </w:pPr>
+      <w:rPr>
+        <w:rFonts w:ascii="Wingdings" w:hAnsi="Wingdings" w:hint="default"/>
+        <w:sz w:val="20"/>
+      </w:rPr>
+    </w:lvl>
+    <w:lvl w:ilvl="3" w:tentative="1">
+      <w:start w:val="1"/>
+      <w:numFmt w:val="bullet"/>
+      <w:lvlText w:val=""/>
+      <w:lvlJc w:val="left"/>
+      <w:pPr>
+        <w:tabs>
+          <w:tab w:val="num" w:pos="2880"/>
+        </w:tabs>
+        <w:ind w:left="2880" w:hanging="360"/>
+      </w:pPr>
+      <w:rPr>
+        <w:rFonts w:ascii="Wingdings" w:hAnsi="Wingdings" w:hint="default"/>
+        <w:sz w:val="20"/>
+      </w:rPr>
+    </w:lvl>
+    <w:lvl w:ilvl="4" w:tentative="1">
+      <w:start w:val="1"/>
+      <w:numFmt w:val="bullet"/>
+      <w:lvlText w:val=""/>
+      <w:lvlJc w:val="left"/>
+      <w:pPr>
+        <w:tabs>
+          <w:tab w:val="num" w:pos="3600"/>
+        </w:tabs>
+        <w:ind w:left="3600" w:hanging="360"/>
+      </w:pPr>
+      <w:rPr>
+        <w:rFonts w:ascii="Wingdings" w:hAnsi="Wingdings" w:hint="default"/>
+        <w:sz w:val="20"/>
+      </w:rPr>
+    </w:lvl>
+    <w:lvl w:ilvl="5" w:tentative="1">
+      <w:start w:val="1"/>
+      <w:numFmt w:val="bullet"/>
+      <w:lvlText w:val=""/>
+      <w:lvlJc w:val="left"/>
+      <w:pPr>
+        <w:tabs>
+          <w:tab w:val="num" w:pos="4320"/>
+        </w:tabs>
+        <w:ind w:left="4320" w:hanging="360"/>
+      </w:pPr>
+      <w:rPr>
+        <w:rFonts w:ascii="Wingdings" w:hAnsi="Wingdings" w:hint="default"/>
+        <w:sz w:val="20"/>
+      </w:rPr>
+    </w:lvl>
+    <w:lvl w:ilvl="6" w:tentative="1">
+      <w:start w:val="1"/>
+      <w:numFmt w:val="bullet"/>
+      <w:lvlText w:val=""/>
+      <w:lvlJc w:val="left"/>
+      <w:pPr>
+        <w:tabs>
+          <w:tab w:val="num" w:pos="5040"/>
+        </w:tabs>
+        <w:ind w:left="5040" w:hanging="360"/>
+      </w:pPr>
+      <w:rPr>
+        <w:rFonts w:ascii="Wingdings" w:hAnsi="Wingdings" w:hint="default"/>
+        <w:sz w:val="20"/>
+      </w:rPr>
+    </w:lvl>
+    <w:lvl w:ilvl="7" w:tentative="1">
+      <w:start w:val="1"/>
+      <w:numFmt w:val="bullet"/>
+      <w:lvlText w:val=""/>
+      <w:lvlJc w:val="left"/>
+      <w:pPr>
+        <w:tabs>
+          <w:tab w:val="num" w:pos="5760"/>
+        </w:tabs>
+        <w:ind w:left="5760" w:hanging="360"/>
+      </w:pPr>
+      <w:rPr>
+        <w:rFonts w:ascii="Wingdings" w:hAnsi="Wingdings" w:hint="default"/>
+        <w:sz w:val="20"/>
+      </w:rPr>
+    </w:lvl>
+    <w:lvl w:ilvl="8" w:tentative="1">
+      <w:start w:val="1"/>
+      <w:numFmt w:val="bullet"/>
+      <w:lvlText w:val=""/>
+      <w:lvlJc w:val="left"/>
+      <w:pPr>
+        <w:tabs>
+          <w:tab w:val="num" w:pos="6480"/>
+        </w:tabs>
+        <w:ind w:left="6480" w:hanging="360"/>
+      </w:pPr>
+      <w:rPr>
+        <w:rFonts w:ascii="Wingdings" w:hAnsi="Wingdings" w:hint="default"/>
+        <w:sz w:val="20"/>
+      </w:rPr>
+    </w:lvl>
+  </w:abstractNum>
+  <w:abstractNum w:abstractNumId="7" w15:restartNumberingAfterBreak="0">
+    <w:nsid w:val="4B110242"/>
+    <w:multiLevelType w:val="multilevel"/>
+    <w:tmpl w:val="B2108D4C"/>
+    <w:lvl w:ilvl="0">
+      <w:start w:val="1"/>
+      <w:numFmt w:val="bullet"/>
+      <w:lvlText w:val=""/>
+      <w:lvlJc w:val="left"/>
+      <w:pPr>
+        <w:tabs>
+          <w:tab w:val="num" w:pos="720"/>
+        </w:tabs>
+        <w:ind w:left="720" w:hanging="360"/>
+      </w:pPr>
+      <w:rPr>
+        <w:rFonts w:ascii="Symbol" w:hAnsi="Symbol" w:hint="default"/>
+        <w:sz w:val="20"/>
+      </w:rPr>
+    </w:lvl>
+    <w:lvl w:ilvl="1" w:tentative="1">
+      <w:start w:val="1"/>
+      <w:numFmt w:val="bullet"/>
+      <w:lvlText w:val="o"/>
+      <w:lvlJc w:val="left"/>
+      <w:pPr>
+        <w:tabs>
+          <w:tab w:val="num" w:pos="1440"/>
+        </w:tabs>
+        <w:ind w:left="1440" w:hanging="360"/>
+      </w:pPr>
+      <w:rPr>
+        <w:rFonts w:ascii="Courier New" w:hAnsi="Courier New" w:hint="default"/>
+        <w:sz w:val="20"/>
+      </w:rPr>
+    </w:lvl>
+    <w:lvl w:ilvl="2" w:tentative="1">
+      <w:start w:val="1"/>
+      <w:numFmt w:val="bullet"/>
+      <w:lvlText w:val=""/>
+      <w:lvlJc w:val="left"/>
+      <w:pPr>
+        <w:tabs>
+          <w:tab w:val="num" w:pos="2160"/>
+        </w:tabs>
+        <w:ind w:left="2160" w:hanging="360"/>
+      </w:pPr>
+      <w:rPr>
+        <w:rFonts w:ascii="Wingdings" w:hAnsi="Wingdings" w:hint="default"/>
+        <w:sz w:val="20"/>
+      </w:rPr>
+    </w:lvl>
+    <w:lvl w:ilvl="3" w:tentative="1">
+      <w:start w:val="1"/>
+      <w:numFmt w:val="bullet"/>
+      <w:lvlText w:val=""/>
+      <w:lvlJc w:val="left"/>
+      <w:pPr>
+        <w:tabs>
+          <w:tab w:val="num" w:pos="2880"/>
+        </w:tabs>
+        <w:ind w:left="2880" w:hanging="360"/>
+      </w:pPr>
+      <w:rPr>
+        <w:rFonts w:ascii="Wingdings" w:hAnsi="Wingdings" w:hint="default"/>
+        <w:sz w:val="20"/>
+      </w:rPr>
+    </w:lvl>
+    <w:lvl w:ilvl="4" w:tentative="1">
+      <w:start w:val="1"/>
+      <w:numFmt w:val="bullet"/>
+      <w:lvlText w:val=""/>
+      <w:lvlJc w:val="left"/>
+      <w:pPr>
+        <w:tabs>
+          <w:tab w:val="num" w:pos="3600"/>
+        </w:tabs>
+        <w:ind w:left="3600" w:hanging="360"/>
+      </w:pPr>
+      <w:rPr>
+        <w:rFonts w:ascii="Wingdings" w:hAnsi="Wingdings" w:hint="default"/>
+        <w:sz w:val="20"/>
+      </w:rPr>
+    </w:lvl>
+    <w:lvl w:ilvl="5" w:tentative="1">
+      <w:start w:val="1"/>
+      <w:numFmt w:val="bullet"/>
+      <w:lvlText w:val=""/>
+      <w:lvlJc w:val="left"/>
+      <w:pPr>
+        <w:tabs>
+          <w:tab w:val="num" w:pos="4320"/>
+        </w:tabs>
+        <w:ind w:left="4320" w:hanging="360"/>
+      </w:pPr>
+      <w:rPr>
+        <w:rFonts w:ascii="Wingdings" w:hAnsi="Wingdings" w:hint="default"/>
+        <w:sz w:val="20"/>
+      </w:rPr>
+    </w:lvl>
+    <w:lvl w:ilvl="6" w:tentative="1">
+      <w:start w:val="1"/>
+      <w:numFmt w:val="bullet"/>
+      <w:lvlText w:val=""/>
+      <w:lvlJc w:val="left"/>
+      <w:pPr>
+        <w:tabs>
+          <w:tab w:val="num" w:pos="5040"/>
+        </w:tabs>
+        <w:ind w:left="5040" w:hanging="360"/>
+      </w:pPr>
+      <w:rPr>
+        <w:rFonts w:ascii="Wingdings" w:hAnsi="Wingdings" w:hint="default"/>
+        <w:sz w:val="20"/>
+      </w:rPr>
+    </w:lvl>
+    <w:lvl w:ilvl="7" w:tentative="1">
+      <w:start w:val="1"/>
+      <w:numFmt w:val="bullet"/>
+      <w:lvlText w:val=""/>
+      <w:lvlJc w:val="left"/>
+      <w:pPr>
+        <w:tabs>
+          <w:tab w:val="num" w:pos="5760"/>
+        </w:tabs>
+        <w:ind w:left="5760" w:hanging="360"/>
+      </w:pPr>
+      <w:rPr>
+        <w:rFonts w:ascii="Wingdings" w:hAnsi="Wingdings" w:hint="default"/>
+        <w:sz w:val="20"/>
+      </w:rPr>
+    </w:lvl>
+    <w:lvl w:ilvl="8" w:tentative="1">
+      <w:start w:val="1"/>
+      <w:numFmt w:val="bullet"/>
+      <w:lvlText w:val=""/>
+      <w:lvlJc w:val="left"/>
+      <w:pPr>
+        <w:tabs>
+          <w:tab w:val="num" w:pos="6480"/>
+        </w:tabs>
+        <w:ind w:left="6480" w:hanging="360"/>
+      </w:pPr>
+      <w:rPr>
+        <w:rFonts w:ascii="Wingdings" w:hAnsi="Wingdings" w:hint="default"/>
+        <w:sz w:val="20"/>
+      </w:rPr>
+    </w:lvl>
+  </w:abstractNum>
+  <w:abstractNum w:abstractNumId="8" w15:restartNumberingAfterBreak="0">
     <w:nsid w:val="4FC56CB7"/>
     <w:multiLevelType w:val="multilevel"/>
     <w:tmpl w:val="E68C3766"/>
@@ -1376,7 +2888,7 @@
       </w:rPr>
     </w:lvl>
   </w:abstractNum>
-  <w:abstractNum w:abstractNumId="4" w15:restartNumberingAfterBreak="0">
+  <w:abstractNum w:abstractNumId="9" w15:restartNumberingAfterBreak="0">
     <w:nsid w:val="52CE5F4E"/>
     <w:multiLevelType w:val="multilevel"/>
     <w:tmpl w:val="0308C712"/>
@@ -1525,7 +3037,7 @@
       </w:rPr>
     </w:lvl>
   </w:abstractNum>
-  <w:abstractNum w:abstractNumId="5" w15:restartNumberingAfterBreak="0">
+  <w:abstractNum w:abstractNumId="10" w15:restartNumberingAfterBreak="0">
     <w:nsid w:val="63E51A7F"/>
     <w:multiLevelType w:val="multilevel"/>
     <w:tmpl w:val="64022C2E"/>
@@ -1674,7 +3186,156 @@
       </w:rPr>
     </w:lvl>
   </w:abstractNum>
-  <w:abstractNum w:abstractNumId="6" w15:restartNumberingAfterBreak="0">
+  <w:abstractNum w:abstractNumId="11" w15:restartNumberingAfterBreak="0">
+    <w:nsid w:val="69E84557"/>
+    <w:multiLevelType w:val="multilevel"/>
+    <w:tmpl w:val="CCA6852C"/>
+    <w:lvl w:ilvl="0">
+      <w:start w:val="1"/>
+      <w:numFmt w:val="bullet"/>
+      <w:lvlText w:val=""/>
+      <w:lvlJc w:val="left"/>
+      <w:pPr>
+        <w:tabs>
+          <w:tab w:val="num" w:pos="720"/>
+        </w:tabs>
+        <w:ind w:left="720" w:hanging="360"/>
+      </w:pPr>
+      <w:rPr>
+        <w:rFonts w:ascii="Symbol" w:hAnsi="Symbol" w:hint="default"/>
+        <w:sz w:val="20"/>
+      </w:rPr>
+    </w:lvl>
+    <w:lvl w:ilvl="1" w:tentative="1">
+      <w:start w:val="1"/>
+      <w:numFmt w:val="bullet"/>
+      <w:lvlText w:val="o"/>
+      <w:lvlJc w:val="left"/>
+      <w:pPr>
+        <w:tabs>
+          <w:tab w:val="num" w:pos="1440"/>
+        </w:tabs>
+        <w:ind w:left="1440" w:hanging="360"/>
+      </w:pPr>
+      <w:rPr>
+        <w:rFonts w:ascii="Courier New" w:hAnsi="Courier New" w:hint="default"/>
+        <w:sz w:val="20"/>
+      </w:rPr>
+    </w:lvl>
+    <w:lvl w:ilvl="2" w:tentative="1">
+      <w:start w:val="1"/>
+      <w:numFmt w:val="bullet"/>
+      <w:lvlText w:val=""/>
+      <w:lvlJc w:val="left"/>
+      <w:pPr>
+        <w:tabs>
+          <w:tab w:val="num" w:pos="2160"/>
+        </w:tabs>
+        <w:ind w:left="2160" w:hanging="360"/>
+      </w:pPr>
+      <w:rPr>
+        <w:rFonts w:ascii="Wingdings" w:hAnsi="Wingdings" w:hint="default"/>
+        <w:sz w:val="20"/>
+      </w:rPr>
+    </w:lvl>
+    <w:lvl w:ilvl="3" w:tentative="1">
+      <w:start w:val="1"/>
+      <w:numFmt w:val="bullet"/>
+      <w:lvlText w:val=""/>
+      <w:lvlJc w:val="left"/>
+      <w:pPr>
+        <w:tabs>
+          <w:tab w:val="num" w:pos="2880"/>
+        </w:tabs>
+        <w:ind w:left="2880" w:hanging="360"/>
+      </w:pPr>
+      <w:rPr>
+        <w:rFonts w:ascii="Wingdings" w:hAnsi="Wingdings" w:hint="default"/>
+        <w:sz w:val="20"/>
+      </w:rPr>
+    </w:lvl>
+    <w:lvl w:ilvl="4" w:tentative="1">
+      <w:start w:val="1"/>
+      <w:numFmt w:val="bullet"/>
+      <w:lvlText w:val=""/>
+      <w:lvlJc w:val="left"/>
+      <w:pPr>
+        <w:tabs>
+          <w:tab w:val="num" w:pos="3600"/>
+        </w:tabs>
+        <w:ind w:left="3600" w:hanging="360"/>
+      </w:pPr>
+      <w:rPr>
+        <w:rFonts w:ascii="Wingdings" w:hAnsi="Wingdings" w:hint="default"/>
+        <w:sz w:val="20"/>
+      </w:rPr>
+    </w:lvl>
+    <w:lvl w:ilvl="5" w:tentative="1">
+      <w:start w:val="1"/>
+      <w:numFmt w:val="bullet"/>
+      <w:lvlText w:val=""/>
+      <w:lvlJc w:val="left"/>
+      <w:pPr>
+        <w:tabs>
+          <w:tab w:val="num" w:pos="4320"/>
+        </w:tabs>
+        <w:ind w:left="4320" w:hanging="360"/>
+      </w:pPr>
+      <w:rPr>
+        <w:rFonts w:ascii="Wingdings" w:hAnsi="Wingdings" w:hint="default"/>
+        <w:sz w:val="20"/>
+      </w:rPr>
+    </w:lvl>
+    <w:lvl w:ilvl="6" w:tentative="1">
+      <w:start w:val="1"/>
+      <w:numFmt w:val="bullet"/>
+      <w:lvlText w:val=""/>
+      <w:lvlJc w:val="left"/>
+      <w:pPr>
+        <w:tabs>
+          <w:tab w:val="num" w:pos="5040"/>
+        </w:tabs>
+        <w:ind w:left="5040" w:hanging="360"/>
+      </w:pPr>
+      <w:rPr>
+        <w:rFonts w:ascii="Wingdings" w:hAnsi="Wingdings" w:hint="default"/>
+        <w:sz w:val="20"/>
+      </w:rPr>
+    </w:lvl>
+    <w:lvl w:ilvl="7" w:tentative="1">
+      <w:start w:val="1"/>
+      <w:numFmt w:val="bullet"/>
+      <w:lvlText w:val=""/>
+      <w:lvlJc w:val="left"/>
+      <w:pPr>
+        <w:tabs>
+          <w:tab w:val="num" w:pos="5760"/>
+        </w:tabs>
+        <w:ind w:left="5760" w:hanging="360"/>
+      </w:pPr>
+      <w:rPr>
+        <w:rFonts w:ascii="Wingdings" w:hAnsi="Wingdings" w:hint="default"/>
+        <w:sz w:val="20"/>
+      </w:rPr>
+    </w:lvl>
+    <w:lvl w:ilvl="8" w:tentative="1">
+      <w:start w:val="1"/>
+      <w:numFmt w:val="bullet"/>
+      <w:lvlText w:val=""/>
+      <w:lvlJc w:val="left"/>
+      <w:pPr>
+        <w:tabs>
+          <w:tab w:val="num" w:pos="6480"/>
+        </w:tabs>
+        <w:ind w:left="6480" w:hanging="360"/>
+      </w:pPr>
+      <w:rPr>
+        <w:rFonts w:ascii="Wingdings" w:hAnsi="Wingdings" w:hint="default"/>
+        <w:sz w:val="20"/>
+      </w:rPr>
+    </w:lvl>
+  </w:abstractNum>
+  <w:abstractNum w:abstractNumId="12" w15:restartNumberingAfterBreak="0">
     <w:nsid w:val="6E2C6E77"/>
     <w:multiLevelType w:val="multilevel"/>
     <w:tmpl w:val="4FF4C200"/>
@@ -1823,7 +3484,7 @@
       </w:rPr>
     </w:lvl>
   </w:abstractNum>
-  <w:abstractNum w:abstractNumId="7" w15:restartNumberingAfterBreak="0">
+  <w:abstractNum w:abstractNumId="13" w15:restartNumberingAfterBreak="0">
     <w:nsid w:val="7666706D"/>
     <w:multiLevelType w:val="multilevel"/>
     <w:tmpl w:val="A8D47A8E"/>
@@ -1973,28 +3634,46 @@
     </w:lvl>
   </w:abstractNum>
   <w:num w:numId="1" w16cid:durableId="1371609626">
+    <w:abstractNumId w:val="8"/>
+  </w:num>
+  <w:num w:numId="2" w16cid:durableId="378211627">
+    <w:abstractNumId w:val="4"/>
+  </w:num>
+  <w:num w:numId="3" w16cid:durableId="1051929278">
+    <w:abstractNumId w:val="9"/>
+  </w:num>
+  <w:num w:numId="4" w16cid:durableId="1881089479">
+    <w:abstractNumId w:val="2"/>
+  </w:num>
+  <w:num w:numId="5" w16cid:durableId="261687153">
+    <w:abstractNumId w:val="13"/>
+  </w:num>
+  <w:num w:numId="6" w16cid:durableId="100996329">
+    <w:abstractNumId w:val="12"/>
+  </w:num>
+  <w:num w:numId="7" w16cid:durableId="609896497">
+    <w:abstractNumId w:val="10"/>
+  </w:num>
+  <w:num w:numId="8" w16cid:durableId="1154418508">
     <w:abstractNumId w:val="3"/>
   </w:num>
-  <w:num w:numId="2" w16cid:durableId="378211627">
-    <w:abstractNumId w:val="2"/>
+  <w:num w:numId="9" w16cid:durableId="297344198">
+    <w:abstractNumId w:val="7"/>
   </w:num>
-  <w:num w:numId="3" w16cid:durableId="1051929278">
-    <w:abstractNumId w:val="4"/>
+  <w:num w:numId="10" w16cid:durableId="1885363943">
+    <w:abstractNumId w:val="1"/>
   </w:num>
-  <w:num w:numId="4" w16cid:durableId="1881089479">
+  <w:num w:numId="11" w16cid:durableId="1119223936">
     <w:abstractNumId w:val="0"/>
   </w:num>
-  <w:num w:numId="5" w16cid:durableId="261687153">
-    <w:abstractNumId w:val="7"/>
+  <w:num w:numId="12" w16cid:durableId="1033192002">
+    <w:abstractNumId w:val="11"/>
   </w:num>
-  <w:num w:numId="6" w16cid:durableId="100996329">
+  <w:num w:numId="13" w16cid:durableId="1503079424">
     <w:abstractNumId w:val="6"/>
   </w:num>
-  <w:num w:numId="7" w16cid:durableId="609896497">
+  <w:num w:numId="14" w16cid:durableId="1778870744">
     <w:abstractNumId w:val="5"/>
-  </w:num>
-  <w:num w:numId="8" w16cid:durableId="1154418508">
-    <w:abstractNumId w:val="1"/>
   </w:num>
 </w:numbering>
 </file>

</xml_diff>